<commit_message>
added version 2.5 Final version
</commit_message>
<xml_diff>
--- a/Spelregels.docx
+++ b/Spelregels.docx
@@ -22,28 +22,15 @@
       <w:r>
         <w:t>(</w:t>
       </w:r>
-      <w:proofErr w:type="gramStart"/>
-      <w:r>
-        <w:t>foto</w:t>
-      </w:r>
-      <w:proofErr w:type="gramEnd"/>
-      <w:r>
-        <w:t xml:space="preserve"> als </w:t>
-      </w:r>
-      <w:proofErr w:type="spellStart"/>
-      <w:r>
-        <w:t>reference</w:t>
-      </w:r>
-      <w:proofErr w:type="spellEnd"/>
-      <w:r>
-        <w:t xml:space="preserve"> voor hand vorm</w:t>
+      <w:r>
+        <w:t>foto als reference voor hand vorm</w:t>
       </w:r>
       <w:r>
         <w:rPr>
           <w:noProof/>
         </w:rPr>
         <w:drawing>
-          <wp:inline distT="0" distB="0" distL="0" distR="0" wp14:anchorId="24A29A2E" wp14:editId="0AB42E8F">
+          <wp:inline distT="0" distB="0" distL="0" distR="0" wp14:anchorId="24A29A2E" wp14:editId="5BD58283">
             <wp:extent cx="1258101" cy="977900"/>
             <wp:effectExtent l="0" t="0" r="0" b="0"/>
             <wp:docPr id="1590904110" name="Afbeelding 1" descr="Witte Rechthoekige Handen Die Een Vierkant of Rechthoekig Kader Maken  Tussen Duim En Wijsvinger Met Vingers Samen. Vrouwelijk Hand Stock  Afbeelding - Afbeelding: 185703181"/>
@@ -333,6 +320,15 @@
       </w:r>
     </w:p>
     <w:p>
+      <w:pPr>
+        <w:rPr>
+          <w:rFonts w:eastAsiaTheme="majorEastAsia" w:cstheme="majorBidi"/>
+          <w:b/>
+          <w:bCs/>
+          <w:sz w:val="28"/>
+          <w:szCs w:val="28"/>
+        </w:rPr>
+      </w:pPr>
       <w:r>
         <w:br w:type="page"/>
       </w:r>
@@ -355,11 +351,9 @@
           <w:sz w:val="28"/>
           <w:szCs w:val="28"/>
         </w:rPr>
-        <w:t xml:space="preserve"> Der Doem 2 NEW</w:t>
-      </w:r>
-    </w:p>
-    <w:p>
-      <w:pPr>
+        <w:t xml:space="preserve"> Der Doem </w:t>
+      </w:r>
+      <w:r>
         <w:rPr>
           <w:rFonts w:eastAsiaTheme="majorEastAsia" w:cstheme="majorBidi"/>
           <w:b/>
@@ -367,19 +361,27 @@
           <w:sz w:val="28"/>
           <w:szCs w:val="28"/>
         </w:rPr>
-      </w:pPr>
-      <w:r>
+        <w:t>2.5</w:t>
+      </w:r>
+    </w:p>
+    <w:p/>
+    <w:p>
+      <w:pPr>
         <w:rPr>
           <w:rFonts w:eastAsiaTheme="majorEastAsia" w:cstheme="majorBidi"/>
           <w:b/>
           <w:bCs/>
-          <w:sz w:val="28"/>
-          <w:szCs w:val="28"/>
+        </w:rPr>
+      </w:pPr>
+      <w:r>
+        <w:rPr>
+          <w:rFonts w:eastAsiaTheme="majorEastAsia" w:cstheme="majorBidi"/>
+          <w:b/>
+          <w:bCs/>
         </w:rPr>
         <w:t>Spel Setup/Regels</w:t>
       </w:r>
     </w:p>
-    <w:p/>
     <w:p>
       <w:pPr>
         <w:pStyle w:val="Lijstalinea"/>
@@ -443,7 +445,14 @@
         <w:t>worp</w:t>
       </w:r>
       <w:r>
-        <w:t xml:space="preserve"> begint</w:t>
+        <w:t xml:space="preserve"> </w:t>
+      </w:r>
+      <w:r>
+        <w:rPr>
+          <w:b/>
+          <w:bCs/>
+        </w:rPr>
+        <w:t>begint</w:t>
       </w:r>
       <w:r>
         <w:t>. Daarna speel je met de klok mee</w:t>
@@ -458,10 +467,19 @@
         </w:numPr>
       </w:pPr>
       <w:r>
-        <w:t>Kies een speler</w:t>
-      </w:r>
-      <w:r>
-        <w:t xml:space="preserve"> tegen wie je gaat vechten</w:t>
+        <w:t>Degene die begint is de aanvaller. Hij k</w:t>
+      </w:r>
+      <w:r>
+        <w:t>ies</w:t>
+      </w:r>
+      <w:r>
+        <w:t>t</w:t>
+      </w:r>
+      <w:r>
+        <w:t xml:space="preserve"> een </w:t>
+      </w:r>
+      <w:r>
+        <w:t xml:space="preserve">speler tegen wie hij gaat vechten </w:t>
       </w:r>
     </w:p>
     <w:p>
@@ -473,7 +491,14 @@
         </w:numPr>
       </w:pPr>
       <w:r>
-        <w:t>Beide spelers leggen 1 kaart gedekt</w:t>
+        <w:t xml:space="preserve">Beide spelers leggen 1 kaart </w:t>
+      </w:r>
+      <w:r>
+        <w:rPr>
+          <w:b/>
+          <w:bCs/>
+        </w:rPr>
+        <w:t>gedekt</w:t>
       </w:r>
       <w:r>
         <w:t xml:space="preserve"> </w:t>
@@ -483,19 +508,42 @@
       </w:r>
       <w:r>
         <w:t>.</w:t>
+      </w:r>
+      <w:r>
+        <w:t xml:space="preserve"> (aas = laagste)</w:t>
       </w:r>
       <w:r>
         <w:br/>
         <w:t>D</w:t>
       </w:r>
       <w:r>
-        <w:t>e aanvaller legt eerst zijn kaarten</w:t>
-      </w:r>
-      <w:r>
-        <w:t>, heb je 2 of meer kaarten met dezelfde waarde</w:t>
-      </w:r>
-      <w:r>
-        <w:t>, mag je deze samen leggen</w:t>
+        <w:t xml:space="preserve">e aanvaller legt </w:t>
+      </w:r>
+      <w:r>
+        <w:rPr>
+          <w:b/>
+          <w:bCs/>
+        </w:rPr>
+        <w:t>eerst</w:t>
+      </w:r>
+      <w:r>
+        <w:t xml:space="preserve"> zijn kaart</w:t>
+      </w:r>
+      <w:r>
+        <w:br/>
+        <w:t>H</w:t>
+      </w:r>
+      <w:r>
+        <w:t>eb je 2 of meer kaarten met dezelfde waarde</w:t>
+      </w:r>
+      <w:r>
+        <w:t xml:space="preserve">, </w:t>
+      </w:r>
+      <w:r>
+        <w:t xml:space="preserve">dan </w:t>
+      </w:r>
+      <w:r>
+        <w:t>mag je deze samen leggen</w:t>
       </w:r>
       <w:r>
         <w:br/>
@@ -542,41 +590,16 @@
         <w:t xml:space="preserve"> tel de waarde van de </w:t>
       </w:r>
       <w:r>
-        <w:t>kaart en de dobbelsteen bij elkaar op. De speler met de hoogste totale waarde wint 1 pion</w:t>
-      </w:r>
-    </w:p>
-    <w:p>
-      <w:pPr>
-        <w:pStyle w:val="Lijstalinea"/>
-        <w:numPr>
-          <w:ilvl w:val="1"/>
-          <w:numId w:val="4"/>
-        </w:numPr>
-      </w:pPr>
-      <w:r>
-        <w:t xml:space="preserve">Bij </w:t>
-      </w:r>
-      <w:r>
-        <w:rPr>
-          <w:b/>
-          <w:bCs/>
-        </w:rPr>
-        <w:t>gelijkspel</w:t>
-      </w:r>
-      <w:r>
-        <w:t xml:space="preserve"> leggen beide spelers opnieuw 1 kaart gedekt neer en gooien ze opnieuw met een dobbelsteen</w:t>
-      </w:r>
-    </w:p>
-    <w:p>
-      <w:pPr>
-        <w:pStyle w:val="Lijstalinea"/>
-        <w:numPr>
-          <w:ilvl w:val="1"/>
-          <w:numId w:val="4"/>
-        </w:numPr>
-      </w:pPr>
-      <w:r>
-        <w:t>De speler met de hoogste totale waarde wint 1 pion</w:t>
+        <w:t xml:space="preserve">kaart en de dobbelsteen bij elkaar op. De speler met de hoogste totale waarde </w:t>
+      </w:r>
+      <w:r>
+        <w:t>krijgt 1 pion van de tegenspeler</w:t>
+      </w:r>
+      <w:r>
+        <w:br/>
+      </w:r>
+      <w:r>
+        <w:t>Enkel de pionnen die je wint tellen als punten (1 pion = 1 punt). Deze hou je altijd bij</w:t>
       </w:r>
     </w:p>
     <w:p>
@@ -588,46 +611,7 @@
         </w:numPr>
       </w:pPr>
       <w:r>
-        <w:t xml:space="preserve">Heb je minstens 1 gebouw van elke kleur, dan krijg je een </w:t>
-      </w:r>
-      <w:r>
-        <w:rPr>
-          <w:b/>
-          <w:bCs/>
-        </w:rPr>
-        <w:t xml:space="preserve">Revival </w:t>
-      </w:r>
-      <w:r>
-        <w:rPr>
-          <w:b/>
-          <w:bCs/>
-        </w:rPr>
-        <w:br/>
-      </w:r>
-      <w:r>
-        <w:t>(een Revival is niet +1 punt)</w:t>
-      </w:r>
-      <w:r>
-        <w:br/>
-        <w:t>Als je dood bent</w:t>
-      </w:r>
-      <w:r>
-        <w:t>,</w:t>
-      </w:r>
-      <w:r>
-        <w:t xml:space="preserve"> </w:t>
-      </w:r>
-      <w:r>
-        <w:t xml:space="preserve">mag </w:t>
-      </w:r>
-      <w:r>
-        <w:t>je 1 gebouw inwisselen voor een Revival,</w:t>
-      </w:r>
-      <w:r>
-        <w:t xml:space="preserve"> dit </w:t>
-      </w:r>
-      <w:r>
-        <w:t>gebouw haal je uit de doos en steel je niet van een andere speler</w:t>
+        <w:t>Na elk gevecht trek je opnieuw kaarten totdat je weer 4 kaarten in je hand hebt</w:t>
       </w:r>
     </w:p>
     <w:p>
@@ -639,9 +623,108 @@
         </w:numPr>
       </w:pPr>
       <w:r>
-        <w:t>Na elk gevecht trek je opnieuw kaarten totdat je weer 4 kaarten in je hand hebt</w:t>
-      </w:r>
-    </w:p>
+        <w:t>Heb je geen pionnen meer? Dan ben je dood, behalve als je een Revival hebt (lees onder)</w:t>
+      </w:r>
+    </w:p>
+    <w:p/>
+    <w:p>
+      <w:pPr>
+        <w:rPr>
+          <w:b/>
+          <w:bCs/>
+        </w:rPr>
+      </w:pPr>
+      <w:r>
+        <w:rPr>
+          <w:b/>
+          <w:bCs/>
+        </w:rPr>
+        <w:t>Bij gelijkspel:</w:t>
+      </w:r>
+    </w:p>
+    <w:p>
+      <w:pPr>
+        <w:pStyle w:val="Lijstalinea"/>
+        <w:numPr>
+          <w:ilvl w:val="0"/>
+          <w:numId w:val="7"/>
+        </w:numPr>
+      </w:pPr>
+      <w:r>
+        <w:t>Beide spelers leggen opnieuw 1 kaart gedekt neer en gooien ze opnieuw met een dobbelsteen, de vorige gelegde kaart blijft op tafel en tel je mee op</w:t>
+      </w:r>
+    </w:p>
+    <w:p>
+      <w:pPr>
+        <w:pStyle w:val="Lijstalinea"/>
+        <w:numPr>
+          <w:ilvl w:val="0"/>
+          <w:numId w:val="7"/>
+        </w:numPr>
+      </w:pPr>
+      <w:r>
+        <w:t>De speler met de hoogste totale waarde wint 1 pion van de tegenstander</w:t>
+      </w:r>
+    </w:p>
+    <w:p/>
+    <w:p>
+      <w:pPr>
+        <w:rPr>
+          <w:b/>
+          <w:bCs/>
+        </w:rPr>
+      </w:pPr>
+      <w:r>
+        <w:rPr>
+          <w:b/>
+          <w:bCs/>
+        </w:rPr>
+        <w:t>Revival:</w:t>
+      </w:r>
+    </w:p>
+    <w:p>
+      <w:pPr>
+        <w:pStyle w:val="Lijstalinea"/>
+        <w:numPr>
+          <w:ilvl w:val="0"/>
+          <w:numId w:val="8"/>
+        </w:numPr>
+      </w:pPr>
+      <w:r>
+        <w:t>Heb je minstens 1 gebouw van elke kleur dat meespeelt, dan krijg je een Revival, je houdt je gebouwen dus bij, je wisselt niets in</w:t>
+      </w:r>
+    </w:p>
+    <w:p>
+      <w:pPr>
+        <w:pStyle w:val="Lijstalinea"/>
+        <w:numPr>
+          <w:ilvl w:val="0"/>
+          <w:numId w:val="8"/>
+        </w:numPr>
+      </w:pPr>
+      <w:r>
+        <w:t>Als je dood bent</w:t>
+      </w:r>
+      <w:r>
+        <w:t xml:space="preserve"> (0 pionnen)</w:t>
+      </w:r>
+      <w:r>
+        <w:t>, dan wissel je je Revival in voor 1 gebouw uit de doos, je steelt niets van andere spelers</w:t>
+      </w:r>
+    </w:p>
+    <w:p>
+      <w:pPr>
+        <w:pStyle w:val="Lijstalinea"/>
+        <w:numPr>
+          <w:ilvl w:val="0"/>
+          <w:numId w:val="8"/>
+        </w:numPr>
+      </w:pPr>
+      <w:r>
+        <w:t>Een Revival kan maar 1 keer gebruikt worden</w:t>
+      </w:r>
+    </w:p>
+    <w:p/>
     <w:sectPr>
       <w:pgSz w:w="11906" w:h="16838"/>
       <w:pgMar w:top="1440" w:right="1440" w:bottom="1440" w:left="1440" w:header="708" w:footer="708" w:gutter="0"/>
@@ -655,6 +738,409 @@
 <file path=word/numbering.xml><?xml version="1.0" encoding="utf-8"?>
 <w:numbering xmlns:wpc="http://schemas.microsoft.com/office/word/2010/wordprocessingCanvas" xmlns:cx="http://schemas.microsoft.com/office/drawing/2014/chartex" xmlns:cx1="http://schemas.microsoft.com/office/drawing/2015/9/8/chartex" xmlns:cx2="http://schemas.microsoft.com/office/drawing/2015/10/21/chartex" xmlns:cx3="http://schemas.microsoft.com/office/drawing/2016/5/9/chartex" xmlns:cx4="http://schemas.microsoft.com/office/drawing/2016/5/10/chartex" xmlns:cx5="http://schemas.microsoft.com/office/drawing/2016/5/11/chartex" xmlns:cx6="http://schemas.microsoft.com/office/drawing/2016/5/12/chartex" xmlns:cx7="http://schemas.microsoft.com/office/drawing/2016/5/13/chartex" xmlns:cx8="http://schemas.microsoft.com/office/drawing/2016/5/14/chartex" xmlns:mc="http://schemas.openxmlformats.org/markup-compatibility/2006" xmlns:aink="http://schemas.microsoft.com/office/drawing/2016/ink" xmlns:am3d="http://schemas.microsoft.com/office/drawing/2017/model3d" xmlns:o="urn:schemas-microsoft-com:office:office" xmlns:oel="http://schemas.microsoft.com/office/2019/extlst" xmlns:r="http://schemas.openxmlformats.org/officeDocument/2006/relationships" xmlns:m="http://schemas.openxmlformats.org/officeDocument/2006/math" xmlns:v="urn:schemas-microsoft-com:vml" xmlns:wp14="http://schemas.microsoft.com/office/word/2010/wordprocessingDrawing" xmlns:wp="http://schemas.openxmlformats.org/drawingml/2006/wordprocessingDrawing" xmlns:w10="urn:schemas-microsoft-com:office:word" xmlns:w="http://schemas.openxmlformats.org/wordprocessingml/2006/main" xmlns:w14="http://schemas.microsoft.com/office/word/2010/wordml" xmlns:w15="http://schemas.microsoft.com/office/word/2012/wordml" xmlns:w16cex="http://schemas.microsoft.com/office/word/2018/wordml/cex" xmlns:w16cid="http://schemas.microsoft.com/office/word/2016/wordml/cid" xmlns:w16="http://schemas.microsoft.com/office/word/2018/wordml" xmlns:w16du="http://schemas.microsoft.com/office/word/2023/wordml/word16du" xmlns:w16sdtdh="http://schemas.microsoft.com/office/word/2020/wordml/sdtdatahash" xmlns:w16sdtfl="http://schemas.microsoft.com/office/word/2024/wordml/sdtformatlock" xmlns:w16se="http://schemas.microsoft.com/office/word/2015/wordml/symex" xmlns:wpg="http://schemas.microsoft.com/office/word/2010/wordprocessingGroup" xmlns:wpi="http://schemas.microsoft.com/office/word/2010/wordprocessingInk" xmlns:wne="http://schemas.microsoft.com/office/word/2006/wordml" xmlns:wps="http://schemas.microsoft.com/office/word/2010/wordprocessingShape" mc:Ignorable="w14 w15 w16se w16cid w16 w16cex w16sdtdh w16sdtfl w16du wp14">
   <w:abstractNum w:abstractNumId="0" w15:restartNumberingAfterBreak="0">
+    <w:nsid w:val="0D010E2C"/>
+    <w:multiLevelType w:val="hybridMultilevel"/>
+    <w:tmpl w:val="A264507A"/>
+    <w:lvl w:ilvl="0" w:tplc="5C0CC5F4">
+      <w:start w:val="1"/>
+      <w:numFmt w:val="bullet"/>
+      <w:lvlText w:val="-"/>
+      <w:lvlJc w:val="left"/>
+      <w:pPr>
+        <w:ind w:left="720" w:hanging="360"/>
+      </w:pPr>
+      <w:rPr>
+        <w:rFonts w:ascii="Arial" w:eastAsiaTheme="minorHAnsi" w:hAnsi="Arial" w:cs="Arial" w:hint="default"/>
+      </w:rPr>
+    </w:lvl>
+    <w:lvl w:ilvl="1" w:tplc="0C000003" w:tentative="1">
+      <w:start w:val="1"/>
+      <w:numFmt w:val="bullet"/>
+      <w:lvlText w:val="o"/>
+      <w:lvlJc w:val="left"/>
+      <w:pPr>
+        <w:ind w:left="1440" w:hanging="360"/>
+      </w:pPr>
+      <w:rPr>
+        <w:rFonts w:ascii="Courier New" w:hAnsi="Courier New" w:cs="Courier New" w:hint="default"/>
+      </w:rPr>
+    </w:lvl>
+    <w:lvl w:ilvl="2" w:tplc="0C000005" w:tentative="1">
+      <w:start w:val="1"/>
+      <w:numFmt w:val="bullet"/>
+      <w:lvlText w:val=""/>
+      <w:lvlJc w:val="left"/>
+      <w:pPr>
+        <w:ind w:left="2160" w:hanging="360"/>
+      </w:pPr>
+      <w:rPr>
+        <w:rFonts w:ascii="Wingdings" w:hAnsi="Wingdings" w:hint="default"/>
+      </w:rPr>
+    </w:lvl>
+    <w:lvl w:ilvl="3" w:tplc="0C000001" w:tentative="1">
+      <w:start w:val="1"/>
+      <w:numFmt w:val="bullet"/>
+      <w:lvlText w:val=""/>
+      <w:lvlJc w:val="left"/>
+      <w:pPr>
+        <w:ind w:left="2880" w:hanging="360"/>
+      </w:pPr>
+      <w:rPr>
+        <w:rFonts w:ascii="Symbol" w:hAnsi="Symbol" w:hint="default"/>
+      </w:rPr>
+    </w:lvl>
+    <w:lvl w:ilvl="4" w:tplc="0C000003" w:tentative="1">
+      <w:start w:val="1"/>
+      <w:numFmt w:val="bullet"/>
+      <w:lvlText w:val="o"/>
+      <w:lvlJc w:val="left"/>
+      <w:pPr>
+        <w:ind w:left="3600" w:hanging="360"/>
+      </w:pPr>
+      <w:rPr>
+        <w:rFonts w:ascii="Courier New" w:hAnsi="Courier New" w:cs="Courier New" w:hint="default"/>
+      </w:rPr>
+    </w:lvl>
+    <w:lvl w:ilvl="5" w:tplc="0C000005" w:tentative="1">
+      <w:start w:val="1"/>
+      <w:numFmt w:val="bullet"/>
+      <w:lvlText w:val=""/>
+      <w:lvlJc w:val="left"/>
+      <w:pPr>
+        <w:ind w:left="4320" w:hanging="360"/>
+      </w:pPr>
+      <w:rPr>
+        <w:rFonts w:ascii="Wingdings" w:hAnsi="Wingdings" w:hint="default"/>
+      </w:rPr>
+    </w:lvl>
+    <w:lvl w:ilvl="6" w:tplc="0C000001" w:tentative="1">
+      <w:start w:val="1"/>
+      <w:numFmt w:val="bullet"/>
+      <w:lvlText w:val=""/>
+      <w:lvlJc w:val="left"/>
+      <w:pPr>
+        <w:ind w:left="5040" w:hanging="360"/>
+      </w:pPr>
+      <w:rPr>
+        <w:rFonts w:ascii="Symbol" w:hAnsi="Symbol" w:hint="default"/>
+      </w:rPr>
+    </w:lvl>
+    <w:lvl w:ilvl="7" w:tplc="0C000003" w:tentative="1">
+      <w:start w:val="1"/>
+      <w:numFmt w:val="bullet"/>
+      <w:lvlText w:val="o"/>
+      <w:lvlJc w:val="left"/>
+      <w:pPr>
+        <w:ind w:left="5760" w:hanging="360"/>
+      </w:pPr>
+      <w:rPr>
+        <w:rFonts w:ascii="Courier New" w:hAnsi="Courier New" w:cs="Courier New" w:hint="default"/>
+      </w:rPr>
+    </w:lvl>
+    <w:lvl w:ilvl="8" w:tplc="0C000005" w:tentative="1">
+      <w:start w:val="1"/>
+      <w:numFmt w:val="bullet"/>
+      <w:lvlText w:val=""/>
+      <w:lvlJc w:val="left"/>
+      <w:pPr>
+        <w:ind w:left="6480" w:hanging="360"/>
+      </w:pPr>
+      <w:rPr>
+        <w:rFonts w:ascii="Wingdings" w:hAnsi="Wingdings" w:hint="default"/>
+      </w:rPr>
+    </w:lvl>
+  </w:abstractNum>
+  <w:abstractNum w:abstractNumId="1" w15:restartNumberingAfterBreak="0">
+    <w:nsid w:val="13C8241A"/>
+    <w:multiLevelType w:val="hybridMultilevel"/>
+    <w:tmpl w:val="7FAA44C0"/>
+    <w:lvl w:ilvl="0" w:tplc="0C00000F">
+      <w:start w:val="1"/>
+      <w:numFmt w:val="decimal"/>
+      <w:lvlText w:val="%1."/>
+      <w:lvlJc w:val="left"/>
+      <w:pPr>
+        <w:ind w:left="720" w:hanging="360"/>
+      </w:pPr>
+      <w:rPr>
+        <w:rFonts w:hint="default"/>
+      </w:rPr>
+    </w:lvl>
+    <w:lvl w:ilvl="1" w:tplc="0C000019" w:tentative="1">
+      <w:start w:val="1"/>
+      <w:numFmt w:val="lowerLetter"/>
+      <w:lvlText w:val="%2."/>
+      <w:lvlJc w:val="left"/>
+      <w:pPr>
+        <w:ind w:left="1440" w:hanging="360"/>
+      </w:pPr>
+    </w:lvl>
+    <w:lvl w:ilvl="2" w:tplc="0C00001B" w:tentative="1">
+      <w:start w:val="1"/>
+      <w:numFmt w:val="lowerRoman"/>
+      <w:lvlText w:val="%3."/>
+      <w:lvlJc w:val="right"/>
+      <w:pPr>
+        <w:ind w:left="2160" w:hanging="180"/>
+      </w:pPr>
+    </w:lvl>
+    <w:lvl w:ilvl="3" w:tplc="0C00000F" w:tentative="1">
+      <w:start w:val="1"/>
+      <w:numFmt w:val="decimal"/>
+      <w:lvlText w:val="%4."/>
+      <w:lvlJc w:val="left"/>
+      <w:pPr>
+        <w:ind w:left="2880" w:hanging="360"/>
+      </w:pPr>
+    </w:lvl>
+    <w:lvl w:ilvl="4" w:tplc="0C000019" w:tentative="1">
+      <w:start w:val="1"/>
+      <w:numFmt w:val="lowerLetter"/>
+      <w:lvlText w:val="%5."/>
+      <w:lvlJc w:val="left"/>
+      <w:pPr>
+        <w:ind w:left="3600" w:hanging="360"/>
+      </w:pPr>
+    </w:lvl>
+    <w:lvl w:ilvl="5" w:tplc="0C00001B" w:tentative="1">
+      <w:start w:val="1"/>
+      <w:numFmt w:val="lowerRoman"/>
+      <w:lvlText w:val="%6."/>
+      <w:lvlJc w:val="right"/>
+      <w:pPr>
+        <w:ind w:left="4320" w:hanging="180"/>
+      </w:pPr>
+    </w:lvl>
+    <w:lvl w:ilvl="6" w:tplc="0C00000F" w:tentative="1">
+      <w:start w:val="1"/>
+      <w:numFmt w:val="decimal"/>
+      <w:lvlText w:val="%7."/>
+      <w:lvlJc w:val="left"/>
+      <w:pPr>
+        <w:ind w:left="5040" w:hanging="360"/>
+      </w:pPr>
+    </w:lvl>
+    <w:lvl w:ilvl="7" w:tplc="0C000019" w:tentative="1">
+      <w:start w:val="1"/>
+      <w:numFmt w:val="lowerLetter"/>
+      <w:lvlText w:val="%8."/>
+      <w:lvlJc w:val="left"/>
+      <w:pPr>
+        <w:ind w:left="5760" w:hanging="360"/>
+      </w:pPr>
+    </w:lvl>
+    <w:lvl w:ilvl="8" w:tplc="0C00001B" w:tentative="1">
+      <w:start w:val="1"/>
+      <w:numFmt w:val="lowerRoman"/>
+      <w:lvlText w:val="%9."/>
+      <w:lvlJc w:val="right"/>
+      <w:pPr>
+        <w:ind w:left="6480" w:hanging="180"/>
+      </w:pPr>
+    </w:lvl>
+  </w:abstractNum>
+  <w:abstractNum w:abstractNumId="2" w15:restartNumberingAfterBreak="0">
+    <w:nsid w:val="36B86E85"/>
+    <w:multiLevelType w:val="hybridMultilevel"/>
+    <w:tmpl w:val="A7EC73F6"/>
+    <w:lvl w:ilvl="0" w:tplc="0C00000F">
+      <w:start w:val="1"/>
+      <w:numFmt w:val="decimal"/>
+      <w:lvlText w:val="%1."/>
+      <w:lvlJc w:val="left"/>
+      <w:pPr>
+        <w:ind w:left="720" w:hanging="360"/>
+      </w:pPr>
+      <w:rPr>
+        <w:rFonts w:hint="default"/>
+      </w:rPr>
+    </w:lvl>
+    <w:lvl w:ilvl="1" w:tplc="0C000019" w:tentative="1">
+      <w:start w:val="1"/>
+      <w:numFmt w:val="lowerLetter"/>
+      <w:lvlText w:val="%2."/>
+      <w:lvlJc w:val="left"/>
+      <w:pPr>
+        <w:ind w:left="1440" w:hanging="360"/>
+      </w:pPr>
+    </w:lvl>
+    <w:lvl w:ilvl="2" w:tplc="0C00001B" w:tentative="1">
+      <w:start w:val="1"/>
+      <w:numFmt w:val="lowerRoman"/>
+      <w:lvlText w:val="%3."/>
+      <w:lvlJc w:val="right"/>
+      <w:pPr>
+        <w:ind w:left="2160" w:hanging="180"/>
+      </w:pPr>
+    </w:lvl>
+    <w:lvl w:ilvl="3" w:tplc="0C00000F" w:tentative="1">
+      <w:start w:val="1"/>
+      <w:numFmt w:val="decimal"/>
+      <w:lvlText w:val="%4."/>
+      <w:lvlJc w:val="left"/>
+      <w:pPr>
+        <w:ind w:left="2880" w:hanging="360"/>
+      </w:pPr>
+    </w:lvl>
+    <w:lvl w:ilvl="4" w:tplc="0C000019" w:tentative="1">
+      <w:start w:val="1"/>
+      <w:numFmt w:val="lowerLetter"/>
+      <w:lvlText w:val="%5."/>
+      <w:lvlJc w:val="left"/>
+      <w:pPr>
+        <w:ind w:left="3600" w:hanging="360"/>
+      </w:pPr>
+    </w:lvl>
+    <w:lvl w:ilvl="5" w:tplc="0C00001B" w:tentative="1">
+      <w:start w:val="1"/>
+      <w:numFmt w:val="lowerRoman"/>
+      <w:lvlText w:val="%6."/>
+      <w:lvlJc w:val="right"/>
+      <w:pPr>
+        <w:ind w:left="4320" w:hanging="180"/>
+      </w:pPr>
+    </w:lvl>
+    <w:lvl w:ilvl="6" w:tplc="0C00000F" w:tentative="1">
+      <w:start w:val="1"/>
+      <w:numFmt w:val="decimal"/>
+      <w:lvlText w:val="%7."/>
+      <w:lvlJc w:val="left"/>
+      <w:pPr>
+        <w:ind w:left="5040" w:hanging="360"/>
+      </w:pPr>
+    </w:lvl>
+    <w:lvl w:ilvl="7" w:tplc="0C000019" w:tentative="1">
+      <w:start w:val="1"/>
+      <w:numFmt w:val="lowerLetter"/>
+      <w:lvlText w:val="%8."/>
+      <w:lvlJc w:val="left"/>
+      <w:pPr>
+        <w:ind w:left="5760" w:hanging="360"/>
+      </w:pPr>
+    </w:lvl>
+    <w:lvl w:ilvl="8" w:tplc="0C00001B" w:tentative="1">
+      <w:start w:val="1"/>
+      <w:numFmt w:val="lowerRoman"/>
+      <w:lvlText w:val="%9."/>
+      <w:lvlJc w:val="right"/>
+      <w:pPr>
+        <w:ind w:left="6480" w:hanging="180"/>
+      </w:pPr>
+    </w:lvl>
+  </w:abstractNum>
+  <w:abstractNum w:abstractNumId="3" w15:restartNumberingAfterBreak="0">
+    <w:nsid w:val="423D5725"/>
+    <w:multiLevelType w:val="hybridMultilevel"/>
+    <w:tmpl w:val="780CFB74"/>
+    <w:lvl w:ilvl="0" w:tplc="9BB040DA">
+      <w:numFmt w:val="bullet"/>
+      <w:lvlText w:val="-"/>
+      <w:lvlJc w:val="left"/>
+      <w:pPr>
+        <w:ind w:left="720" w:hanging="360"/>
+      </w:pPr>
+      <w:rPr>
+        <w:rFonts w:ascii="Arial" w:eastAsiaTheme="minorHAnsi" w:hAnsi="Arial" w:cs="Arial" w:hint="default"/>
+      </w:rPr>
+    </w:lvl>
+    <w:lvl w:ilvl="1" w:tplc="0C000003" w:tentative="1">
+      <w:start w:val="1"/>
+      <w:numFmt w:val="bullet"/>
+      <w:lvlText w:val="o"/>
+      <w:lvlJc w:val="left"/>
+      <w:pPr>
+        <w:ind w:left="1440" w:hanging="360"/>
+      </w:pPr>
+      <w:rPr>
+        <w:rFonts w:ascii="Courier New" w:hAnsi="Courier New" w:cs="Courier New" w:hint="default"/>
+      </w:rPr>
+    </w:lvl>
+    <w:lvl w:ilvl="2" w:tplc="0C000005" w:tentative="1">
+      <w:start w:val="1"/>
+      <w:numFmt w:val="bullet"/>
+      <w:lvlText w:val=""/>
+      <w:lvlJc w:val="left"/>
+      <w:pPr>
+        <w:ind w:left="2160" w:hanging="360"/>
+      </w:pPr>
+      <w:rPr>
+        <w:rFonts w:ascii="Wingdings" w:hAnsi="Wingdings" w:hint="default"/>
+      </w:rPr>
+    </w:lvl>
+    <w:lvl w:ilvl="3" w:tplc="0C000001" w:tentative="1">
+      <w:start w:val="1"/>
+      <w:numFmt w:val="bullet"/>
+      <w:lvlText w:val=""/>
+      <w:lvlJc w:val="left"/>
+      <w:pPr>
+        <w:ind w:left="2880" w:hanging="360"/>
+      </w:pPr>
+      <w:rPr>
+        <w:rFonts w:ascii="Symbol" w:hAnsi="Symbol" w:hint="default"/>
+      </w:rPr>
+    </w:lvl>
+    <w:lvl w:ilvl="4" w:tplc="0C000003" w:tentative="1">
+      <w:start w:val="1"/>
+      <w:numFmt w:val="bullet"/>
+      <w:lvlText w:val="o"/>
+      <w:lvlJc w:val="left"/>
+      <w:pPr>
+        <w:ind w:left="3600" w:hanging="360"/>
+      </w:pPr>
+      <w:rPr>
+        <w:rFonts w:ascii="Courier New" w:hAnsi="Courier New" w:cs="Courier New" w:hint="default"/>
+      </w:rPr>
+    </w:lvl>
+    <w:lvl w:ilvl="5" w:tplc="0C000005" w:tentative="1">
+      <w:start w:val="1"/>
+      <w:numFmt w:val="bullet"/>
+      <w:lvlText w:val=""/>
+      <w:lvlJc w:val="left"/>
+      <w:pPr>
+        <w:ind w:left="4320" w:hanging="360"/>
+      </w:pPr>
+      <w:rPr>
+        <w:rFonts w:ascii="Wingdings" w:hAnsi="Wingdings" w:hint="default"/>
+      </w:rPr>
+    </w:lvl>
+    <w:lvl w:ilvl="6" w:tplc="0C000001" w:tentative="1">
+      <w:start w:val="1"/>
+      <w:numFmt w:val="bullet"/>
+      <w:lvlText w:val=""/>
+      <w:lvlJc w:val="left"/>
+      <w:pPr>
+        <w:ind w:left="5040" w:hanging="360"/>
+      </w:pPr>
+      <w:rPr>
+        <w:rFonts w:ascii="Symbol" w:hAnsi="Symbol" w:hint="default"/>
+      </w:rPr>
+    </w:lvl>
+    <w:lvl w:ilvl="7" w:tplc="0C000003" w:tentative="1">
+      <w:start w:val="1"/>
+      <w:numFmt w:val="bullet"/>
+      <w:lvlText w:val="o"/>
+      <w:lvlJc w:val="left"/>
+      <w:pPr>
+        <w:ind w:left="5760" w:hanging="360"/>
+      </w:pPr>
+      <w:rPr>
+        <w:rFonts w:ascii="Courier New" w:hAnsi="Courier New" w:cs="Courier New" w:hint="default"/>
+      </w:rPr>
+    </w:lvl>
+    <w:lvl w:ilvl="8" w:tplc="0C000005" w:tentative="1">
+      <w:start w:val="1"/>
+      <w:numFmt w:val="bullet"/>
+      <w:lvlText w:val=""/>
+      <w:lvlJc w:val="left"/>
+      <w:pPr>
+        <w:ind w:left="6480" w:hanging="360"/>
+      </w:pPr>
+      <w:rPr>
+        <w:rFonts w:ascii="Wingdings" w:hAnsi="Wingdings" w:hint="default"/>
+      </w:rPr>
+    </w:lvl>
+  </w:abstractNum>
+  <w:abstractNum w:abstractNumId="4" w15:restartNumberingAfterBreak="0">
     <w:nsid w:val="4820326B"/>
     <w:multiLevelType w:val="hybridMultilevel"/>
     <w:tmpl w:val="518A9756"/>
@@ -743,7 +1229,7 @@
       </w:pPr>
     </w:lvl>
   </w:abstractNum>
-  <w:abstractNum w:abstractNumId="1" w15:restartNumberingAfterBreak="0">
+  <w:abstractNum w:abstractNumId="5" w15:restartNumberingAfterBreak="0">
     <w:nsid w:val="61B119D5"/>
     <w:multiLevelType w:val="hybridMultilevel"/>
     <w:tmpl w:val="7DE655DA"/>
@@ -832,7 +1318,7 @@
       </w:pPr>
     </w:lvl>
   </w:abstractNum>
-  <w:abstractNum w:abstractNumId="2" w15:restartNumberingAfterBreak="0">
+  <w:abstractNum w:abstractNumId="6" w15:restartNumberingAfterBreak="0">
     <w:nsid w:val="623837C5"/>
     <w:multiLevelType w:val="multilevel"/>
     <w:tmpl w:val="67AEE504"/>
@@ -953,7 +1439,7 @@
       </w:rPr>
     </w:lvl>
   </w:abstractNum>
-  <w:abstractNum w:abstractNumId="3" w15:restartNumberingAfterBreak="0">
+  <w:abstractNum w:abstractNumId="7" w15:restartNumberingAfterBreak="0">
     <w:nsid w:val="74AB0C3C"/>
     <w:multiLevelType w:val="hybridMultilevel"/>
     <w:tmpl w:val="66BC9566"/>
@@ -1043,15 +1529,27 @@
     </w:lvl>
   </w:abstractNum>
   <w:num w:numId="1" w16cid:durableId="729118028">
+    <w:abstractNumId w:val="7"/>
+  </w:num>
+  <w:num w:numId="2" w16cid:durableId="1201895999">
+    <w:abstractNumId w:val="4"/>
+  </w:num>
+  <w:num w:numId="3" w16cid:durableId="1735003978">
+    <w:abstractNumId w:val="5"/>
+  </w:num>
+  <w:num w:numId="4" w16cid:durableId="573663148">
+    <w:abstractNumId w:val="6"/>
+  </w:num>
+  <w:num w:numId="5" w16cid:durableId="246959841">
     <w:abstractNumId w:val="3"/>
   </w:num>
-  <w:num w:numId="2" w16cid:durableId="1201895999">
+  <w:num w:numId="6" w16cid:durableId="568538509">
     <w:abstractNumId w:val="0"/>
   </w:num>
-  <w:num w:numId="3" w16cid:durableId="1735003978">
+  <w:num w:numId="7" w16cid:durableId="493032810">
     <w:abstractNumId w:val="1"/>
   </w:num>
-  <w:num w:numId="4" w16cid:durableId="573663148">
+  <w:num w:numId="8" w16cid:durableId="236549306">
     <w:abstractNumId w:val="2"/>
   </w:num>
 </w:numbering>

</xml_diff>